<commit_message>
Match the Mini Report styles to the full Workbench and fix the tables
The style template now carries the full Workbench's report styles: Aptos
body text, the same heading sizes, colors, and spacing, and a white on navy
table header. Normal no longer carries a color. A paragraph style outranks
a table style, so that color painted the header text navy on the navy fill.

Two table defects are fixed. The header row style centers the header row,
and the FillDB module removed the table's own centering, so its header sat
10.5 pt to the right of the body rows. The FillDB tables are now centered.
The header row style also had contextual spacing, which made Word drop the
space before every header cell except the first, so the first header cell
sat 3 pt lower than the rest. It is removed from the table style.

Checked in Word on the three sample Mini Reports: 0 of 14 tables are off,
against 11 of 14 before.

Co-Authored-By: Claude Opus 5.5 (1M context) <noreply@anthropic.com>
</commit_message>
<xml_diff>
--- a/Templates/Diagnostics_Style_Template.docx
+++ b/Templates/Diagnostics_Style_Template.docx
@@ -375,9 +375,11 @@
     <w:name w:val="Normal"/>
     <w:qFormat/>
     <w:rsid w:val="00FC693F"/>
+    <w:pPr>
+      <w:spacing w:before="120" w:after="120"/>
+    </w:pPr>
     <w:rPr>
-      <w:rFonts w:ascii="Inter" w:hAnsi="Inter" w:cs="Inter" w:eastAsia="Inter"/>
-      <w:color w:val="000032"/>
+      <w:rFonts w:ascii="Aptos" w:hAnsi="Aptos" w:cs="Aptos" w:eastAsia="Aptos"/>
       <w:sz w:val="22"/>
     </w:rPr>
   </w:style>
@@ -436,15 +438,16 @@
     <w:pPr>
       <w:keepNext/>
       <w:keepLines/>
-      <w:spacing w:before="480" w:after="0"/>
+      <w:spacing w:before="240" w:after="180"/>
       <w:outlineLvl w:val="0"/>
     </w:pPr>
     <w:rPr>
-      <w:rFonts w:ascii="Inter" w:hAnsi="Inter" w:cs="Inter" w:eastAsia="Inter"/>
+      <w:rFonts w:ascii="Aptos" w:hAnsi="Aptos" w:cs="Aptos" w:eastAsia="Aptos"/>
       <w:b/>
       <w:bCs/>
-      <w:color w:val="000032"/>
-      <w:sz w:val="40"/>
+      <w:i w:val="0"/>
+      <w:color w:val="0B1640"/>
+      <w:sz w:val="48"/>
       <w:szCs w:val="28"/>
     </w:rPr>
   </w:style>
@@ -460,15 +463,16 @@
     <w:pPr>
       <w:keepNext/>
       <w:keepLines/>
-      <w:spacing w:before="200" w:after="0"/>
+      <w:spacing w:before="240"/>
       <w:outlineLvl w:val="1"/>
     </w:pPr>
     <w:rPr>
-      <w:rFonts w:ascii="Inter" w:hAnsi="Inter" w:cs="Inter" w:eastAsia="Inter"/>
+      <w:rFonts w:ascii="Aptos" w:hAnsi="Aptos" w:cs="Aptos" w:eastAsia="Aptos"/>
       <w:b/>
       <w:bCs/>
-      <w:color w:val="000032"/>
-      <w:sz w:val="32"/>
+      <w:i w:val="0"/>
+      <w:color w:val="102A54"/>
+      <w:sz w:val="36"/>
       <w:szCs w:val="26"/>
     </w:rPr>
   </w:style>
@@ -482,16 +486,17 @@
     <w:qFormat/>
     <w:rsid w:val="00FC693F"/>
     <w:pPr>
-      <w:keepNext/>
-      <w:keepLines/>
-      <w:spacing w:before="200" w:after="0"/>
+      <w:keepNext w:val="0"/>
+      <w:keepLines w:val="0"/>
+      <w:spacing w:before="60" w:after="60" w:line="276" w:lineRule="auto"/>
       <w:outlineLvl w:val="2"/>
     </w:pPr>
     <w:rPr>
-      <w:rFonts w:ascii="Inter" w:hAnsi="Inter" w:cs="Inter" w:eastAsia="Inter"/>
+      <w:rFonts w:ascii="Aptos" w:hAnsi="Aptos" w:cs="Aptos" w:eastAsia="Aptos"/>
       <w:b/>
       <w:bCs/>
-      <w:color w:val="000032"/>
+      <w:i w:val="0"/>
+      <w:color w:val="0B1640"/>
       <w:sz w:val="28"/>
     </w:rPr>
   </w:style>
@@ -508,17 +513,17 @@
     <w:pPr>
       <w:keepNext/>
       <w:keepLines/>
-      <w:spacing w:before="200" w:after="0"/>
+      <w:spacing w:before="200"/>
       <w:outlineLvl w:val="3"/>
     </w:pPr>
     <w:rPr>
-      <w:rFonts w:ascii="Inter" w:hAnsi="Inter" w:cs="Inter" w:eastAsia="Inter"/>
+      <w:rFonts w:ascii="Aptos" w:hAnsi="Aptos" w:cs="Aptos" w:eastAsia="Aptos"/>
       <w:b/>
       <w:bCs/>
-      <w:i/>
+      <w:i w:val="0"/>
       <w:iCs/>
-      <w:color w:val="000032"/>
-      <w:sz w:val="24"/>
+      <w:color w:val="1452E6"/>
+      <w:sz w:val="28"/>
     </w:rPr>
   </w:style>
   <w:style w:type="paragraph" w:styleId="Heading5">
@@ -731,11 +736,11 @@
       <w:contextualSpacing/>
     </w:pPr>
     <w:rPr>
-      <w:rFonts w:ascii="Inter" w:hAnsi="Inter" w:cs="Inter" w:eastAsia="Inter"/>
-      <w:color w:val="000032"/>
+      <w:rFonts w:ascii="Aptos" w:hAnsi="Aptos" w:cs="Aptos" w:eastAsia="Aptos"/>
+      <w:color w:val="17365D" w:themeColor="text2" w:themeShade="BF"/>
       <w:spacing w:val="5"/>
       <w:kern w:val="28"/>
-      <w:sz w:val="52"/>
+      <w:sz w:val="56"/>
       <w:szCs w:val="52"/>
     </w:rPr>
   </w:style>
@@ -804,8 +809,7 @@
       <w:contextualSpacing/>
     </w:pPr>
     <w:rPr>
-      <w:rFonts w:ascii="Inter" w:hAnsi="Inter" w:cs="Inter" w:eastAsia="Inter"/>
-      <w:color w:val="000032"/>
+      <w:rFonts w:ascii="Aptos" w:hAnsi="Aptos" w:cs="Aptos" w:eastAsia="Aptos"/>
     </w:rPr>
   </w:style>
   <w:style w:type="paragraph" w:styleId="BodyText">
@@ -916,8 +920,7 @@
       <w:contextualSpacing/>
     </w:pPr>
     <w:rPr>
-      <w:rFonts w:ascii="Inter" w:hAnsi="Inter" w:cs="Inter" w:eastAsia="Inter"/>
-      <w:color w:val="000032"/>
+      <w:rFonts w:ascii="Aptos" w:hAnsi="Aptos" w:cs="Aptos" w:eastAsia="Aptos"/>
     </w:rPr>
   </w:style>
   <w:style w:type="paragraph" w:styleId="ListBullet2">
@@ -959,8 +962,7 @@
       <w:contextualSpacing/>
     </w:pPr>
     <w:rPr>
-      <w:rFonts w:ascii="Inter" w:hAnsi="Inter" w:cs="Inter" w:eastAsia="Inter"/>
-      <w:color w:val="000032"/>
+      <w:rFonts w:ascii="Aptos" w:hAnsi="Aptos" w:cs="Aptos" w:eastAsia="Aptos"/>
     </w:rPr>
   </w:style>
   <w:style w:type="paragraph" w:styleId="ListNumber2">
@@ -1185,10 +1187,10 @@
       <w:spacing w:line="240" w:lineRule="auto"/>
     </w:pPr>
     <w:rPr>
-      <w:rFonts w:ascii="Inter" w:hAnsi="Inter" w:cs="Inter" w:eastAsia="Inter"/>
+      <w:rFonts w:ascii="Aptos" w:hAnsi="Aptos" w:cs="Aptos" w:eastAsia="Aptos"/>
       <w:b/>
       <w:bCs/>
-      <w:color w:val="000032"/>
+      <w:color w:val="4F81BD" w:themeColor="accent1"/>
       <w:sz w:val="18"/>
       <w:szCs w:val="18"/>
     </w:rPr>
@@ -12086,7 +12088,7 @@
       <w:spacing w:before="80" w:after="80"/>
     </w:pPr>
     <w:rPr>
-      <w:rFonts w:ascii="Inter" w:hAnsi="Inter" w:cs="Inter"/>
+      <w:rFonts w:ascii="Aptos" w:hAnsi="Aptos" w:cs="Aptos"/>
     </w:rPr>
     <w:tblPr>
       <w:tblStyleRowBandSize w:val="1"/>
@@ -12115,11 +12117,10 @@
       <w:pPr>
         <w:wordWrap/>
         <w:spacing w:before="80" w:after="80" w:line="240" w:lineRule="auto"/>
-        <w:contextualSpacing/>
         <w:jc w:val="center"/>
       </w:pPr>
       <w:rPr>
-        <w:rFonts w:ascii="Inter" w:hAnsi="Inter" w:cs="Inter"/>
+        <w:rFonts w:ascii="Aptos" w:hAnsi="Aptos" w:cs="Aptos"/>
         <w:b/>
         <w:bCs/>
         <w:color w:val="FFFFFF"/>
@@ -12148,7 +12149,7 @@
     </w:tblStylePr>
     <w:tblStylePr w:type="band1Horz">
       <w:rPr>
-        <w:rFonts w:ascii="Inter" w:hAnsi="Inter" w:cs="Inter"/>
+        <w:rFonts w:ascii="Aptos" w:hAnsi="Aptos" w:cs="Aptos"/>
         <w:color w:val="auto"/>
         <w:sz w:val="22"/>
       </w:rPr>
@@ -12159,7 +12160,7 @@
     </w:tblStylePr>
     <w:tblStylePr w:type="band2Horz">
       <w:rPr>
-        <w:rFonts w:ascii="Inter" w:hAnsi="Inter" w:cs="Inter"/>
+        <w:rFonts w:ascii="Aptos" w:hAnsi="Aptos" w:cs="Aptos"/>
         <w:color w:val="auto"/>
         <w:sz w:val="22"/>
       </w:rPr>

</xml_diff>

<commit_message>
Apply Design's heading styles to the Mini Report template
Duncan approved Design's Proposed Styles from the 10-19 review. H3 is 16 pt
with 20 pt before, 6 pt after, keep with next and a 0.75 pt rule above, so
a section separates from the table before it. H4 is 12 pt, so it reads as
part of its section. Normal spacing is 0 pt before and 8 pt after. Normal
keeps no color, because a color there paints over the white header text
of the BigFixContent table style. The builder is the source and the
template is regenerated from it.

Co-Authored-By: Claude Opus 5.5 <noreply@anthropic.com>
</commit_message>
<xml_diff>
--- a/Templates/Diagnostics_Style_Template.docx
+++ b/Templates/Diagnostics_Style_Template.docx
@@ -376,7 +376,7 @@
     <w:qFormat/>
     <w:rsid w:val="00FC693F"/>
     <w:pPr>
-      <w:spacing w:before="120" w:after="120"/>
+      <w:spacing w:before="0" w:after="160"/>
     </w:pPr>
     <w:rPr>
       <w:rFonts w:ascii="Aptos" w:hAnsi="Aptos" w:cs="Aptos" w:eastAsia="Aptos"/>
@@ -486,9 +486,12 @@
     <w:qFormat/>
     <w:rsid w:val="00FC693F"/>
     <w:pPr>
-      <w:keepNext w:val="0"/>
-      <w:keepLines w:val="0"/>
-      <w:spacing w:before="60" w:after="60" w:line="276" w:lineRule="auto"/>
+      <w:keepNext/>
+      <w:keepLines/>
+      <w:pBdr>
+        <w:top w:val="single" w:sz="6" w:space="8" w:color="E3E9F1"/>
+      </w:pBdr>
+      <w:spacing w:before="400" w:after="120"/>
       <w:outlineLvl w:val="2"/>
     </w:pPr>
     <w:rPr>
@@ -497,7 +500,7 @@
       <w:bCs/>
       <w:i w:val="0"/>
       <w:color w:val="0B1640"/>
-      <w:sz w:val="28"/>
+      <w:sz w:val="32"/>
     </w:rPr>
   </w:style>
   <w:style w:type="paragraph" w:styleId="Heading4">
@@ -513,7 +516,7 @@
     <w:pPr>
       <w:keepNext/>
       <w:keepLines/>
-      <w:spacing w:before="200"/>
+      <w:spacing w:before="280" w:after="80"/>
       <w:outlineLvl w:val="3"/>
     </w:pPr>
     <w:rPr>
@@ -523,7 +526,7 @@
       <w:i w:val="0"/>
       <w:iCs/>
       <w:color w:val="1452E6"/>
-      <w:sz w:val="28"/>
+      <w:sz w:val="24"/>
     </w:rPr>
   </w:style>
   <w:style w:type="paragraph" w:styleId="Heading5">

</xml_diff>

<commit_message>
Revert "Apply Design's heading styles to the Mini Report template"
This reverts commit efa3bd3be9d0f5f55308a1ac9d68ea9e9ae90126.
</commit_message>
<xml_diff>
--- a/Templates/Diagnostics_Style_Template.docx
+++ b/Templates/Diagnostics_Style_Template.docx
@@ -376,7 +376,7 @@
     <w:qFormat/>
     <w:rsid w:val="00FC693F"/>
     <w:pPr>
-      <w:spacing w:before="0" w:after="160"/>
+      <w:spacing w:before="120" w:after="120"/>
     </w:pPr>
     <w:rPr>
       <w:rFonts w:ascii="Aptos" w:hAnsi="Aptos" w:cs="Aptos" w:eastAsia="Aptos"/>
@@ -486,12 +486,9 @@
     <w:qFormat/>
     <w:rsid w:val="00FC693F"/>
     <w:pPr>
-      <w:keepNext/>
-      <w:keepLines/>
-      <w:pBdr>
-        <w:top w:val="single" w:sz="6" w:space="8" w:color="E3E9F1"/>
-      </w:pBdr>
-      <w:spacing w:before="400" w:after="120"/>
+      <w:keepNext w:val="0"/>
+      <w:keepLines w:val="0"/>
+      <w:spacing w:before="60" w:after="60" w:line="276" w:lineRule="auto"/>
       <w:outlineLvl w:val="2"/>
     </w:pPr>
     <w:rPr>
@@ -500,7 +497,7 @@
       <w:bCs/>
       <w:i w:val="0"/>
       <w:color w:val="0B1640"/>
-      <w:sz w:val="32"/>
+      <w:sz w:val="28"/>
     </w:rPr>
   </w:style>
   <w:style w:type="paragraph" w:styleId="Heading4">
@@ -516,7 +513,7 @@
     <w:pPr>
       <w:keepNext/>
       <w:keepLines/>
-      <w:spacing w:before="280" w:after="80"/>
+      <w:spacing w:before="200"/>
       <w:outlineLvl w:val="3"/>
     </w:pPr>
     <w:rPr>
@@ -526,7 +523,7 @@
       <w:i w:val="0"/>
       <w:iCs/>
       <w:color w:val="1452E6"/>
-      <w:sz w:val="24"/>
+      <w:sz w:val="28"/>
     </w:rPr>
   </w:style>
   <w:style w:type="paragraph" w:styleId="Heading5">

</xml_diff>

<commit_message>
Set heading 3, 4 and 5 from Design's 10-20 change list
Section 1 of Design's change list, approved by Duncan. Heading 3 is 16 pt
with 18 pt before, 6 pt after and keep with next. Heading 4 stays 14 pt
with 12 pt before and 4 pt after. Heading 5 is 12 pt Aptos bold #102A54
with 10 pt before and 2 pt after. Each level is now smaller than the one
above. No border, no new font and no change to Normal.

Co-Authored-By: Claude Opus 5.5 <noreply@anthropic.com>
</commit_message>
<xml_diff>
--- a/Templates/Diagnostics_Style_Template.docx
+++ b/Templates/Diagnostics_Style_Template.docx
@@ -486,9 +486,9 @@
     <w:qFormat/>
     <w:rsid w:val="00FC693F"/>
     <w:pPr>
-      <w:keepNext w:val="0"/>
-      <w:keepLines w:val="0"/>
-      <w:spacing w:before="60" w:after="60" w:line="276" w:lineRule="auto"/>
+      <w:keepNext/>
+      <w:keepLines/>
+      <w:spacing w:before="360" w:after="120" w:line="276" w:lineRule="auto"/>
       <w:outlineLvl w:val="2"/>
     </w:pPr>
     <w:rPr>
@@ -497,7 +497,7 @@
       <w:bCs/>
       <w:i w:val="0"/>
       <w:color w:val="0B1640"/>
-      <w:sz w:val="28"/>
+      <w:sz w:val="32"/>
     </w:rPr>
   </w:style>
   <w:style w:type="paragraph" w:styleId="Heading4">
@@ -513,7 +513,7 @@
     <w:pPr>
       <w:keepNext/>
       <w:keepLines/>
-      <w:spacing w:before="200"/>
+      <w:spacing w:before="240" w:after="80"/>
       <w:outlineLvl w:val="3"/>
     </w:pPr>
     <w:rPr>
@@ -539,12 +539,15 @@
     <w:pPr>
       <w:keepNext/>
       <w:keepLines/>
-      <w:spacing w:before="200" w:after="0"/>
+      <w:spacing w:before="200" w:after="40"/>
       <w:outlineLvl w:val="4"/>
     </w:pPr>
     <w:rPr>
-      <w:rFonts w:asciiTheme="majorHAnsi" w:eastAsiaTheme="majorEastAsia" w:hAnsiTheme="majorHAnsi" w:cstheme="majorBidi"/>
-      <w:color w:val="243F60" w:themeColor="accent1" w:themeShade="7F"/>
+      <w:rFonts w:ascii="Aptos" w:hAnsi="Aptos" w:cs="Aptos" w:eastAsia="Aptos"/>
+      <w:b/>
+      <w:i w:val="0"/>
+      <w:color w:val="102A54"/>
+      <w:sz w:val="24"/>
     </w:rPr>
   </w:style>
   <w:style w:type="paragraph" w:styleId="Heading6">

</xml_diff>

<commit_message>
Checkpoint standalone report changes before Code review response
Save pending Client guidance, heading hierarchy, table layout, legend readability, PerfMon wording, template, and regression-test changes before starting the review response. This is a recovery checkpoint of the current review baseline.
</commit_message>
<xml_diff>
--- a/Templates/Diagnostics_Style_Template.docx
+++ b/Templates/Diagnostics_Style_Template.docx
@@ -578,18 +578,18 @@
     <w:pPr>
       <w:keepNext/>
       <w:keepLines/>
-      <w:spacing w:before="240" w:after="80" w:line="240" w:lineRule="auto"/>
+      <w:spacing w:before="320" w:after="120" w:line="240" w:lineRule="auto"/>
       <w:outlineLvl w:val="3"/>
     </w:pPr>
     <w:rPr>
       <w:rFonts w:ascii="Aptos" w:hAnsi="Aptos" w:cs="Aptos" w:eastAsia="Aptos"/>
-      <w:b/>
-      <w:bCs/>
+      <w:b w:val="1"/>
+      <w:bCs w:val="1"/>
       <w:i w:val="0"/>
       <w:iCs/>
-      <w:color w:val="000032"/>
-      <w:sz w:val="24"/>
-      <w:szCs w:val="24"/>
+      <w:color w:val="007A8A"/>
+      <w:sz w:val="28"/>
+      <w:szCs w:val="28"/>
     </w:rPr>
   </w:style>
   <w:style w:type="paragraph" w:styleId="Heading5">
@@ -12186,7 +12186,7 @@
     <w:tblStylePr w:type="firstRow">
       <w:pPr>
         <w:wordWrap/>
-        <w:spacing w:before="80" w:after="80" w:line="240" w:lineRule="auto"/>
+        <w:spacing w:before="0" w:after="0" w:line="240" w:lineRule="auto"/>
         <w:jc w:val="left"/>
       </w:pPr>
       <w:rPr>
@@ -12250,6 +12250,44 @@
       </w:numPr>
       <w:ind w:left="280" w:hanging="200"/>
     </w:pPr>
+  </w:style>
+  <w:style w:type="paragraph" w:customStyle="1" w:styleId="ReportTableHeader">
+    <w:name w:val="Report Table Header"/>
+    <w:basedOn w:val="Normal"/>
+    <w:pPr>
+      <w:keepNext/>
+      <w:spacing w:before="0" w:after="0" w:line="240" w:lineRule="auto"/>
+    </w:pPr>
+  </w:style>
+  <w:style w:type="paragraph" w:customStyle="1" w:styleId="CapacityHost">
+    <w:name w:val="Capacity Host"/>
+    <w:basedOn w:val="Normal"/>
+    <w:pPr>
+      <w:keepNext/>
+      <w:keepLines/>
+      <w:spacing w:before="280" w:after="40" w:line="240" w:lineRule="auto"/>
+    </w:pPr>
+    <w:rPr>
+      <w:b/>
+      <w:i w:val="0"/>
+      <w:color w:val="000032"/>
+      <w:sz w:val="24"/>
+    </w:rPr>
+  </w:style>
+  <w:style w:type="paragraph" w:customStyle="1" w:styleId="CapacityHostDetails">
+    <w:name w:val="Capacity Host Details"/>
+    <w:basedOn w:val="Normal"/>
+    <w:pPr>
+      <w:keepNext/>
+      <w:keepLines/>
+      <w:spacing w:before="0" w:after="80" w:line="240" w:lineRule="auto"/>
+    </w:pPr>
+    <w:rPr>
+      <w:b w:val="0"/>
+      <w:i w:val="0"/>
+      <w:color w:val="000032"/>
+      <w:sz w:val="22"/>
+    </w:rPr>
   </w:style>
 </w:styles>
 </file>

</xml_diff>